<commit_message>
Final Polish: Fixed color preservation, layout/bullets, stutter-proof Tamil restoration, and heading cleanup
</commit_message>
<xml_diff>
--- a/uploads/translated_Sample Input File English.docx
+++ b/uploads/translated_Sample Input File English.docx
@@ -3,33 +3,55 @@
 <w:document xmlns:wpc="http://schemas.microsoft.com/office/word/2010/wordprocessingCanvas" xmlns:cx="http://schemas.microsoft.com/office/drawing/2014/chartex" xmlns:cx1="http://schemas.microsoft.com/office/drawing/2015/9/8/chartex" xmlns:cx2="http://schemas.microsoft.com/office/drawing/2015/10/21/chartex" xmlns:cx3="http://schemas.microsoft.com/office/drawing/2016/5/9/chartex" xmlns:cx4="http://schemas.microsoft.com/office/drawing/2016/5/10/chartex" xmlns:cx5="http://schemas.microsoft.com/office/drawing/2016/5/11/chartex" xmlns:cx6="http://schemas.microsoft.com/office/drawing/2016/5/12/chartex" xmlns:cx7="http://schemas.microsoft.com/office/drawing/2016/5/13/chartex" xmlns:cx8="http://schemas.microsoft.com/office/drawing/2016/5/14/chartex" xmlns:mc="http://schemas.openxmlformats.org/markup-compatibility/2006" xmlns:aink="http://schemas.microsoft.com/office/drawing/2016/ink" xmlns:am3d="http://schemas.microsoft.com/office/drawing/2017/model3d" xmlns:o="urn:schemas-microsoft-com:office:office" xmlns:r="http://schemas.openxmlformats.org/officeDocument/2006/relationships" xmlns:m="http://schemas.openxmlformats.org/officeDocument/2006/math" xmlns:v="urn:schemas-microsoft-com:vml" xmlns:wp14="http://schemas.microsoft.com/office/word/2010/wordprocessingDrawing" xmlns:wp="http://schemas.openxmlformats.org/drawingml/2006/wordprocessingDrawing" xmlns:w10="urn:schemas-microsoft-com:office:word" xmlns:w="http://schemas.openxmlformats.org/wordprocessingml/2006/main" xmlns:w14="http://schemas.microsoft.com/office/word/2010/wordml" xmlns:w15="http://schemas.microsoft.com/office/word/2012/wordml" xmlns:w16cex="http://schemas.microsoft.com/office/word/2018/wordml/cex" xmlns:w16cid="http://schemas.microsoft.com/office/word/2016/wordml/cid" xmlns:w16="http://schemas.microsoft.com/office/word/2018/wordml" xmlns:w16sdtdh="http://schemas.microsoft.com/office/word/2020/wordml/sdtdatahash" xmlns:w16se="http://schemas.microsoft.com/office/word/2015/wordml/symex" xmlns:wpg="http://schemas.microsoft.com/office/word/2010/wordprocessingGroup" xmlns:wpi="http://schemas.microsoft.com/office/word/2010/wordprocessingInk" xmlns:wne="http://schemas.microsoft.com/office/word/2006/wordml" xmlns:wps="http://schemas.microsoft.com/office/word/2010/wordprocessingShape" mc:Ignorable="w14 w15 w16se w16cid w16 w16cex w16sdtdh wp14">
   <w:body>
     <w:p>
+      <w:pPr>
+        <w:pStyle w:val="Title"/>
+      </w:pPr>
       <w:r>
         <w:rPr>
           <w:color w:val="FF0000"/>
-          <w:spacing w:val="-2"/>
-        </w:rPr>
-        <w:t>System</w:t>
+          <w:highlight w:val="yellow"/>
+        </w:rPr>
+        <w:t>என்ஜின்</w:t>
       </w:r>
       <w:r>
         <w:rPr>
           <w:color w:val="FF0000"/>
         </w:rPr>
-        <w:t>इंजन स्नेहन प्रणाली इंजन स्नेहन प्रणाली</w:t>
+        <w:t xml:space="preserve"> </w:t>
+      </w:r>
+      <w:r>
+        <w:rPr>
+          <w:color w:val="FF0000"/>
+          <w:highlight w:val="yellow"/>
+        </w:rPr>
+        <w:t>லூப்ரிகேஷன்</w:t>
+      </w:r>
+      <w:r>
+        <w:rPr>
+          <w:color w:val="FF0000"/>
+        </w:rPr>
+        <w:t xml:space="preserve"> </w:t>
+      </w:r>
+      <w:r>
+        <w:rPr>
+          <w:color w:val="FF0000"/>
+          <w:highlight w:val="yellow"/>
+        </w:rPr>
+        <w:t>சிஸ்டம்</w:t>
       </w:r>
     </w:p>
     <w:p>
+      <w:pPr>
+        <w:pStyle w:val="Heading1"/>
+        <w:spacing w:before="192"/>
+        <w:ind w:left="1463" w:right="1850"/>
+        <w:jc w:val="center"/>
+      </w:pPr>
       <w:r>
         <w:rPr>
           <w:color w:val="007F00"/>
-          <w:spacing w:val="-2"/>
-        </w:rPr>
-        <w:t>Description</w:t>
-      </w:r>
-      <w:r>
-        <w:rPr>
-          <w:color w:val="007F00"/>
-        </w:rPr>
-        <w:t>सामान्य विवरण</w:t>
+        </w:rPr>
+        <w:t>பொது விவரக்குறிப்பு</w:t>
       </w:r>
     </w:p>
     <w:p>
@@ -48,18 +70,35 @@
       </w:pPr>
     </w:p>
     <w:p>
+      <w:pPr>
+        <w:pStyle w:val="Heading2"/>
+        <w:spacing w:before="174"/>
+      </w:pPr>
       <w:r>
         <w:rPr>
           <w:color w:val="0000FF"/>
-          <w:spacing w:val="-2"/>
-        </w:rPr>
-        <w:t>Description</w:t>
+          <w:highlight w:val="yellow"/>
+        </w:rPr>
+        <w:t>என்ஜின்</w:t>
       </w:r>
       <w:r>
         <w:rPr>
           <w:color w:val="0000FF"/>
         </w:rPr>
-        <w:t>स्नेहन विवरण इंजन स्नेहन विवरण</w:t>
+        <w:t xml:space="preserve"> </w:t>
+      </w:r>
+      <w:r>
+        <w:rPr>
+          <w:color w:val="0000FF"/>
+          <w:highlight w:val="yellow"/>
+        </w:rPr>
+        <w:t>லூப்ரிகேஷன்</w:t>
+      </w:r>
+      <w:r>
+        <w:rPr>
+          <w:color w:val="0000FF"/>
+        </w:rPr>
+        <w:t xml:space="preserve"> Description</w:t>
       </w:r>
     </w:p>
     <w:p>
@@ -84,14 +123,13 @@
       </w:pPr>
     </w:p>
     <w:p>
-      <w:r>
-        <w:rPr>
-          <w:color w:val="FF0000"/>
-          <w:spacing w:val="-2"/>
+      <w:pPr>
+        <w:spacing w:line="154" w:lineRule="exact"/>
+        <w:ind w:left="16"/>
+        <w:rPr>
           <w:sz w:val="14"/>
         </w:rPr>
-        <w:t>(03(01)</w:t>
-      </w:r>
+      </w:pPr>
       <w:r>
         <w:rPr>
           <w:color w:val="FF0000"/>
@@ -118,273 +156,960 @@
       </w:pPr>
     </w:p>
     <w:p>
-      <w:r>
-        <w:rPr>
-          <w:spacing w:val="-2"/>
-        </w:rPr>
-        <w:t>crankshaft.</w:t>
-      </w:r>
-      <w:r>
-        <w:rPr/>
-        <w:t>तेल पंप एक पैराचोइड प्रकार का है, जो टाइमिंग चेन कवर में स्थापित है और क्रेनशाफ्ट द्वारा संचालित है।</w:t>
+      <w:pPr>
+        <w:pStyle w:val="BodyText"/>
+        <w:spacing w:line="223" w:lineRule="exact"/>
+        <w:ind w:left="16"/>
+        <w:jc w:val="both"/>
+      </w:pPr>
+      <w:r>
+        <w:rPr>
+          <w:highlight w:val="yellow"/>
+        </w:rPr>
+        <w:t>ஆயில் பம்ப்</w:t>
+      </w:r>
+      <w:r>
+        <w:rPr/>
+        <w:t xml:space="preserve"> என்பது ஒரு பராக்கோய்டு வகை, </w:t>
+      </w:r>
+      <w:r>
+        <w:rPr>
+          <w:highlight w:val="yellow"/>
+        </w:rPr>
+        <w:t>டைமிங் செயின் கவர்</w:t>
+      </w:r>
+      <w:r>
+        <w:rPr/>
+        <w:t xml:space="preserve"> இல் நிறுவப்பட்டுள்ளது மற்றும் </w:t>
+      </w:r>
+      <w:r>
+        <w:rPr>
+          <w:highlight w:val="yellow"/>
+        </w:rPr>
+        <w:t>க்ராங்க்ஷாப்ட்</w:t>
+      </w:r>
+      <w:r>
+        <w:rPr/>
+        <w:t xml:space="preserve"> ஆல் இயக்கப்படுகிறது.</w:t>
       </w:r>
     </w:p>
     <w:p>
-      <w:r>
-        <w:t>lubricated or pressurized by delivered oil as follows.</w:t>
-      </w:r>
-      <w:r>
-        <w:rPr/>
-        <w:t>तेल को तेल पंप स्ट्रेनर के माध्यम से खींचा जाता है और पंप के माध्यम से तेल फ़िल्टर तक जाता है। फ़िल्टर किया गया तेल सिलेंडर ब्लॉक में मुख्य तेल गैलरी में बहता है। मुख्य गैलरी से तेल क्रेनशाफ्ट मुख्य बीयरिंग और सिलेंडर सिर को आपूर्ति की जाती है। एक तेल मार्ग क्रेनशाफ्ट मुख्य बीयरिंग के पीछे के हिस्से के माध्यम से उप गैलरी से जुड़ा हुआ है। निम्नलिखित उपकरणों को वितरित तेल द्वारा निम्नानुसार चिकनाई या दबाव बनाया जाता है।</w:t>
+      <w:pPr>
+        <w:pStyle w:val="BodyText"/>
+        <w:spacing w:before="10" w:line="249" w:lineRule="auto"/>
+        <w:ind w:left="16" w:right="457"/>
+        <w:jc w:val="both"/>
+      </w:pPr>
+      <w:r>
+        <w:rPr>
+          <w:highlight w:val="yellow"/>
+        </w:rPr>
+        <w:t>ஆயில் பம்ப்</w:t>
+      </w:r>
+      <w:r>
+        <w:rPr/>
+        <w:t xml:space="preserve"> ஸ்ட்ரேயர் வழியாக எண்ணெய் வரவழைக்கப்படுகிறது, பின்னர் பம்ப் வழியாக </w:t>
+      </w:r>
+      <w:r>
+        <w:rPr>
+          <w:highlight w:val="yellow"/>
+        </w:rPr>
+        <w:t>ஆயில் பில்ட்டர்</w:t>
+      </w:r>
+      <w:r>
+        <w:rPr/>
+        <w:t xml:space="preserve"> க்கு செல்கிறது. வடிகட்டப்பட்ட எண்ணெயானது </w:t>
+      </w:r>
+      <w:r>
+        <w:rPr>
+          <w:highlight w:val="yellow"/>
+        </w:rPr>
+        <w:t>சிலின்டர் பிளாக்</w:t>
+      </w:r>
+      <w:r>
+        <w:rPr/>
+        <w:t xml:space="preserve"> இல் உள்ள பிரதான எண்ணெய்த் தொகுப்பிற்குள் பாய்கிறது. பிரதான தொகுப்பிலிருந்து வரும் எண்ணெய்யை </w:t>
+      </w:r>
+      <w:r>
+        <w:rPr>
+          <w:highlight w:val="yellow"/>
+        </w:rPr>
+        <w:t>க்ராங்க்ஷாப்ட்</w:t>
+      </w:r>
+      <w:r>
+        <w:rPr/>
+        <w:t xml:space="preserve"> </w:t>
+      </w:r>
+      <w:r>
+        <w:rPr>
+          <w:highlight w:val="yellow"/>
+        </w:rPr>
+        <w:t>மெயின் பியரிங்ஸ்</w:t>
+      </w:r>
+      <w:r>
+        <w:rPr/>
+        <w:t xml:space="preserve"> மற்றும் </w:t>
+      </w:r>
+      <w:r>
+        <w:rPr>
+          <w:highlight w:val="yellow"/>
+        </w:rPr>
+        <w:t>சிலின்டர் ஹெட்</w:t>
+      </w:r>
+      <w:r>
+        <w:rPr/>
+        <w:t xml:space="preserve"> ஆகியவற்றிற்கு வழங்கப்படுகிறது. ஒரு எண்ணெயில் பாதை </w:t>
+      </w:r>
+      <w:r>
+        <w:rPr>
+          <w:highlight w:val="yellow"/>
+        </w:rPr>
+        <w:t>க்ராங்க்ஷாப்ட்</w:t>
+      </w:r>
+      <w:r>
+        <w:rPr/>
+        <w:t xml:space="preserve"> _ பிரதான தாங்குதளத்தின் பின்புறம் வழியாக துணை தொகுப்புக்கு இணைக்கப்படுகிறது. பின்வரும் சாதனங்கள் வழங்கப்படும் எண்ணெயால் பின்வருமாறு மெருகூட்டப்படுகின்றன அல்லது அழுத்தப்படுகின்றன.</w:t>
       </w:r>
     </w:p>
     <w:p>
-      <w:r>
-        <w:rPr>
-          <w:spacing w:val="-2"/>
+      <w:pPr>
+        <w:pStyle w:val="ListParagraph"/>
+        <w:numPr>
+          <w:ilvl w:val="0"/>
+          <w:numId w:val="14"/>
+        </w:numPr>
+        <w:tabs>
+          <w:tab w:val="left" w:pos="242"/>
+        </w:tabs>
+        <w:spacing w:before="59"/>
+        <w:ind w:left="242" w:hanging="226"/>
+        <w:jc w:val="both"/>
+        <w:rPr>
           <w:sz w:val="20"/>
         </w:rPr>
-        <w:t>journal</w:t>
-      </w:r>
+      </w:pPr>
       <w:r>
         <w:rPr>
           <w:sz w:val="20"/>
-        </w:rPr>
-        <w:t>क्रेनशाफ्ट जर्नल</w:t>
+          <w:highlight w:val="yellow"/>
+        </w:rPr>
+        <w:t>க்ராங்க்ஷாப்ட்</w:t>
+      </w:r>
+      <w:r>
+        <w:rPr>
+          <w:sz w:val="20"/>
+        </w:rPr>
+        <w:t xml:space="preserve"> journal</w:t>
       </w:r>
     </w:p>
     <w:p>
-      <w:r>
-        <w:t>rod to lubricate cylinder wall, piston pin, piston and piston rings.</w:t>
-      </w:r>
-      <w:r>
-        <w:rPr/>
-        <w:t>क्रेनशाफ्ट जर्नल का समर्थन करने वाले मुख्य बीयरिंग्स को चिकनाई की जाती है और तेल को क्रेनशाफ्ट में छेद के माध्यम से क्रॉसिंग मार्गों के माध्यम से कनेक्टिंग रॉड बीयरिंग्स में आपूर्ति की जाती है, और फिर प्रत्येक कनेक्टिंग रॉड के बड़े अंत से सिलेंडर दीवार, पिस्टन पिन, पिस्टन और पिस्टन रिंग्स को चिकनाई करने के लिए स्प्रे किया जाता है।</w:t>
+      <w:pPr>
+        <w:pStyle w:val="BodyText"/>
+        <w:spacing w:before="10" w:line="249" w:lineRule="auto"/>
+        <w:ind w:left="243" w:right="454"/>
+        <w:jc w:val="both"/>
+      </w:pPr>
+      <w:r>
+        <w:rPr>
+          <w:highlight w:val="yellow"/>
+        </w:rPr>
+        <w:t>மெயின் பியரிங்ஸ்</w:t>
+      </w:r>
+      <w:r>
+        <w:rPr/>
+        <w:t xml:space="preserve"> </w:t>
+      </w:r>
+      <w:r>
+        <w:rPr>
+          <w:highlight w:val="yellow"/>
+        </w:rPr>
+        <w:t>க்ராங்க்ஷாப்ட்</w:t>
+      </w:r>
+      <w:r>
+        <w:rPr/>
+        <w:t xml:space="preserve"> </w:t>
+      </w:r>
+      <w:r>
+        <w:rPr>
+          <w:highlight w:val="yellow"/>
+        </w:rPr>
+        <w:t>ஜெர்னல்ஸ்</w:t>
+      </w:r>
+      <w:r>
+        <w:rPr/>
+        <w:t xml:space="preserve"> ஐ ஆதரிக்கும் _ </w:t>
+      </w:r>
+      <w:r>
+        <w:rPr>
+          <w:highlight w:val="yellow"/>
+        </w:rPr>
+        <w:t>க்ராங்க்ஷாப்ட்</w:t>
+      </w:r>
+      <w:r>
+        <w:rPr/>
+        <w:t xml:space="preserve"> க்கு மெருகூட்டப்பட்டு, எண்ணெய் </w:t>
+      </w:r>
+      <w:r>
+        <w:rPr>
+          <w:highlight w:val="yellow"/>
+        </w:rPr>
+        <w:t>கனெக்டிங் ராட்</w:t>
+      </w:r>
+      <w:r>
+        <w:rPr/>
+        <w:t xml:space="preserve"> தாங்கு உருளைகளுக்கு </w:t>
+      </w:r>
+      <w:r>
+        <w:rPr>
+          <w:highlight w:val="yellow"/>
+        </w:rPr>
+        <w:t>க்ராங்க்ஷாப்ட்</w:t>
+      </w:r>
+      <w:r>
+        <w:rPr/>
+        <w:t xml:space="preserve"> _ இல் துளைத்த குறுக்குவெட்டுகள் மூலம் வழங்கப்படுகிறது, பின்னர் ஒவ்வொரு </w:t>
+      </w:r>
+      <w:r>
+        <w:rPr>
+          <w:highlight w:val="yellow"/>
+        </w:rPr>
+        <w:t>கனெக்டிங் ராட்</w:t>
+      </w:r>
+      <w:r>
+        <w:rPr/>
+        <w:t xml:space="preserve"> _ இன் பெரிய விளிம்பில் இருந்து splashed </w:t>
+      </w:r>
+      <w:r>
+        <w:rPr>
+          <w:highlight w:val="yellow"/>
+        </w:rPr>
+        <w:t>சிலின்டர்</w:t>
+      </w:r>
+      <w:r>
+        <w:rPr/>
+        <w:t xml:space="preserve"> wall, </w:t>
+      </w:r>
+      <w:r>
+        <w:rPr>
+          <w:highlight w:val="yellow"/>
+        </w:rPr>
+        <w:t>பிஸ்டன் பின்</w:t>
+      </w:r>
+      <w:r>
+        <w:rPr/>
+        <w:t xml:space="preserve"> , </w:t>
+      </w:r>
+      <w:r>
+        <w:rPr>
+          <w:highlight w:val="yellow"/>
+        </w:rPr>
+        <w:t>பிஸ்டன்</w:t>
+      </w:r>
+      <w:r>
+        <w:rPr/>
+        <w:t xml:space="preserve"> and </w:t>
+      </w:r>
+      <w:r>
+        <w:rPr>
+          <w:highlight w:val="yellow"/>
+        </w:rPr>
+        <w:t>பிஸ்டன் ரிங்க்ஸ்</w:t>
+      </w:r>
+      <w:r>
+        <w:rPr/>
+        <w:t xml:space="preserve"> ...</w:t>
       </w:r>
     </w:p>
     <w:p>
-      <w:r>
-        <w:rPr>
-          <w:spacing w:val="-5"/>
+      <w:pPr>
+        <w:pStyle w:val="ListParagraph"/>
+        <w:numPr>
+          <w:ilvl w:val="0"/>
+          <w:numId w:val="14"/>
+        </w:numPr>
+        <w:tabs>
+          <w:tab w:val="left" w:pos="242"/>
+        </w:tabs>
+        <w:spacing w:before="59"/>
+        <w:ind w:left="242" w:hanging="226"/>
+        <w:jc w:val="both"/>
+        <w:rPr>
           <w:sz w:val="20"/>
         </w:rPr>
-        <w:t>jet</w:t>
-      </w:r>
+      </w:pPr>
       <w:r>
         <w:rPr>
           <w:sz w:val="20"/>
-        </w:rPr>
-        <w:t>टाइमिंग चेन ऑयल जेट</w:t>
+          <w:highlight w:val="yellow"/>
+        </w:rPr>
+        <w:t>டைமிங் செயின்</w:t>
+      </w:r>
+      <w:r>
+        <w:rPr>
+          <w:sz w:val="20"/>
+        </w:rPr>
+        <w:t xml:space="preserve"> எண்ணெய் ஜெட் __TERM_1</w:t>
       </w:r>
     </w:p>
     <w:p>
-      <w:r>
-        <w:t>lubrication of the timing chain, timing sprockets, timing chain tensioner and timing chain guide.</w:t>
-      </w:r>
-      <w:r>
-        <w:rPr/>
-        <w:t>मुख्य गैलरी और मुख्य बीयरिंग के बीच एक तेल मार्ग से तेल को जेट में आपूर्ति की जाती है और टाइमिंग चेन, टाइमिंग स्प्रॉकेट, टाइमिंग चेन टेंशनर और टाइमिंग चेन गाइड के स्नेहन के लिए इंजेक्शन दिया जाता है।</w:t>
+      <w:pPr>
+        <w:pStyle w:val="BodyText"/>
+        <w:spacing w:before="10" w:line="249" w:lineRule="auto"/>
+        <w:ind w:left="243" w:right="457"/>
+        <w:jc w:val="both"/>
+      </w:pPr>
+      <w:r>
+        <w:rPr/>
+        <w:t xml:space="preserve">பிரதான கேலரி மற்றும் பிரதான தாங்கு உருளை இடையே ஒரு எண்ணெய் பாய்ச்சலில் இருந்து பெட்ரோல் ஜெட் வழங்கப்படுகிறது மற்றும் </w:t>
+      </w:r>
+      <w:r>
+        <w:rPr>
+          <w:highlight w:val="yellow"/>
+        </w:rPr>
+        <w:t>டைமிங் செயின்</w:t>
+      </w:r>
+      <w:r>
+        <w:rPr/>
+        <w:t xml:space="preserve"> , டைமிங் ஸ்ப்ரோக்கெட்டுகள், </w:t>
+      </w:r>
+      <w:r>
+        <w:rPr>
+          <w:highlight w:val="yellow"/>
+        </w:rPr>
+        <w:t>டைமிங் செயின்</w:t>
+      </w:r>
+      <w:r>
+        <w:rPr/>
+        <w:t xml:space="preserve"> டென்ஷனர் மற்றும் _ </w:t>
+      </w:r>
+      <w:r>
+        <w:rPr>
+          <w:highlight w:val="yellow"/>
+        </w:rPr>
+        <w:t>டைமிங் செயின்</w:t>
+      </w:r>
+      <w:r>
+        <w:rPr/>
+        <w:t xml:space="preserve"> வழிகாட்டியின் </w:t>
+      </w:r>
+      <w:r>
+        <w:rPr>
+          <w:highlight w:val="yellow"/>
+        </w:rPr>
+        <w:t>லூப்ரிகேஷன்</w:t>
+      </w:r>
+      <w:r>
+        <w:rPr/>
+        <w:t xml:space="preserve"> க்கு செலுத்தப்படுகிறது.</w:t>
       </w:r>
     </w:p>
     <w:p>
-      <w:r>
-        <w:rPr>
-          <w:spacing w:val="-5"/>
+      <w:pPr>
+        <w:pStyle w:val="ListParagraph"/>
+        <w:numPr>
+          <w:ilvl w:val="0"/>
+          <w:numId w:val="14"/>
+        </w:numPr>
+        <w:tabs>
+          <w:tab w:val="left" w:pos="242"/>
+        </w:tabs>
+        <w:spacing w:before="60"/>
+        <w:ind w:left="242" w:hanging="226"/>
+        <w:jc w:val="both"/>
+        <w:rPr>
           <w:sz w:val="20"/>
         </w:rPr>
-        <w:t xml:space="preserve"> jet</w:t>
-      </w:r>
+      </w:pPr>
       <w:r>
         <w:rPr>
           <w:sz w:val="20"/>
-        </w:rPr>
-        <w:t>पिस्टन कूलिंग जेट</w:t>
+          <w:highlight w:val="yellow"/>
+        </w:rPr>
+        <w:t>பிஸ்டன்</w:t>
+      </w:r>
+      <w:r>
+        <w:rPr>
+          <w:sz w:val="20"/>
+        </w:rPr>
+        <w:t xml:space="preserve"> குளிரூட்டும் ஜெட்</w:t>
       </w:r>
     </w:p>
     <w:p>
-      <w:r>
-        <w:rPr>
-          <w:spacing w:val="-2"/>
-        </w:rPr>
-        <w:t>cooling.</w:t>
-      </w:r>
-      <w:r>
-        <w:rPr/>
-        <w:t>उप गैलरी से तेल को अतिरिक्त पिस्टन शीतलन के लिए प्रत्येक पिस्टन में जेट के माध्यम से इंजेक्ट किया जाता है।</w:t>
+      <w:pPr>
+        <w:pStyle w:val="BodyText"/>
+        <w:spacing w:before="10"/>
+        <w:ind w:left="243"/>
+        <w:jc w:val="both"/>
+      </w:pPr>
+      <w:r>
+        <w:rPr/>
+        <w:t xml:space="preserve">துணை கேலரியில் இருந்து வரும் எண்ணெய் ஒவ்வொரு </w:t>
+      </w:r>
+      <w:r>
+        <w:rPr>
+          <w:highlight w:val="yellow"/>
+        </w:rPr>
+        <w:t>பிஸ்டன்</w:t>
+      </w:r>
+      <w:r>
+        <w:rPr/>
+        <w:t xml:space="preserve"> க்கும் ஜெட் வழியாக ஊசி போடப்படுகிறது, மேலும் கூடுதல் </w:t>
+      </w:r>
+      <w:r>
+        <w:rPr>
+          <w:highlight w:val="yellow"/>
+        </w:rPr>
+        <w:t>பிஸ்டன்</w:t>
+      </w:r>
+      <w:r>
+        <w:rPr/>
+        <w:t xml:space="preserve"> _ குளிரூட்டலுக்காக.</w:t>
       </w:r>
     </w:p>
     <w:p>
-      <w:r>
-        <w:rPr>
-          <w:spacing w:val="-2"/>
+      <w:pPr>
+        <w:pStyle w:val="ListParagraph"/>
+        <w:numPr>
+          <w:ilvl w:val="0"/>
+          <w:numId w:val="14"/>
+        </w:numPr>
+        <w:tabs>
+          <w:tab w:val="left" w:pos="242"/>
+        </w:tabs>
+        <w:ind w:left="242" w:hanging="226"/>
+        <w:jc w:val="both"/>
+        <w:rPr>
           <w:sz w:val="20"/>
         </w:rPr>
-        <w:t>adjuster</w:t>
-      </w:r>
+      </w:pPr>
       <w:r>
         <w:rPr>
           <w:sz w:val="20"/>
         </w:rPr>
-        <w:t>तनाव समायोजक</w:t>
+        <w:t>டென்ஷியர் அட்ஜஸ்டர்</w:t>
       </w:r>
     </w:p>
     <w:p>
-      <w:r>
-        <w:t>of the chain tension.</w:t>
-      </w:r>
-      <w:r>
-        <w:rPr/>
-        <w:t>मुख्य बीयरिंग से जुड़े एक तेल मार्ग से तेल चेन तनाव को समायोजित करने के लिए तनाव समायोजक को दबाव प्रदान करता है।</w:t>
+      <w:pPr>
+        <w:pStyle w:val="BodyText"/>
+        <w:spacing w:before="10" w:line="249" w:lineRule="auto"/>
+        <w:ind w:left="243" w:right="455"/>
+        <w:jc w:val="both"/>
+      </w:pPr>
+      <w:r>
+        <w:rPr/>
+        <w:t>பிரதான தாங்கு உருளைக்கு இணைக்கப்பட்ட எண்ணெய் வழித்தடத்திலிருந்து வரும் எண்ணெயானது சங்கிலி அழுத்தத்தை சரிசெய்ய tensioner சரிசெய்திக்கு அழுத்தம் கொடுக்கிறது.</w:t>
       </w:r>
     </w:p>
     <w:p>
-      <w:r>
-        <w:rPr>
-          <w:spacing w:val="-4"/>
+      <w:pPr>
+        <w:pStyle w:val="ListParagraph"/>
+        <w:numPr>
+          <w:ilvl w:val="0"/>
+          <w:numId w:val="14"/>
+        </w:numPr>
+        <w:tabs>
+          <w:tab w:val="left" w:pos="242"/>
+        </w:tabs>
+        <w:spacing w:before="58"/>
+        <w:ind w:left="242" w:hanging="226"/>
+        <w:jc w:val="both"/>
+        <w:rPr>
           <w:sz w:val="20"/>
         </w:rPr>
-        <w:t>head</w:t>
-      </w:r>
+      </w:pPr>
       <w:r>
         <w:rPr>
           <w:sz w:val="20"/>
-        </w:rPr>
-        <w:t>सिलेंडर हेड</w:t>
+          <w:highlight w:val="yellow"/>
+        </w:rPr>
+        <w:t>சிலின்டர் ஹெட்</w:t>
       </w:r>
     </w:p>
     <w:p>
-      <w:r>
-        <w:rPr>
-          <w:spacing w:val="-2"/>
-        </w:rPr>
-        <w:t>independently.</w:t>
-      </w:r>
-      <w:r>
-        <w:rPr/>
-        <w:t>मुख्य गैलरी से तेल ओसीवी को टाइमिंग चेन कवर के माध्यम से आपूर्ति की जाती है और शेष तेल कैमशाफ्ट फ्रंट निचले आवास तक जाता है और फिर स्वतंत्र रूप से इनपुट पक्ष और निकास पक्ष पर सिलेंडर हेड में छेद किए गए मार्गों में विभाजित होता है।</w:t>
+      <w:pPr>
+        <w:pStyle w:val="BodyText"/>
+        <w:spacing w:before="10" w:line="249" w:lineRule="auto"/>
+        <w:ind w:left="243" w:right="401"/>
+      </w:pPr>
+      <w:r>
+        <w:rPr/>
+        <w:t xml:space="preserve">பிரதான கேலரியில் இருந்து எண்ணெய் </w:t>
+      </w:r>
+      <w:r>
+        <w:rPr>
+          <w:highlight w:val="yellow"/>
+        </w:rPr>
+        <w:t>டைமிங் செயின் கவர்</w:t>
+      </w:r>
+      <w:r>
+        <w:rPr/>
+        <w:t xml:space="preserve"> வழியாக OCV களுக்கு வழங்கப்படுகிறது, மீதமுள்ள எண்ணெய்யானது </w:t>
+      </w:r>
+      <w:r>
+        <w:rPr>
+          <w:highlight w:val="yellow"/>
+        </w:rPr>
+        <w:t>கேம்ஷாப்ட்</w:t>
+      </w:r>
+      <w:r>
+        <w:rPr/>
+        <w:t xml:space="preserve"> முன் கீழ் அறை வரை செல்கிறது, பின்னர் உள் நுழைவு பக்கத்திலும், வெளியேற்ற பக்கத்திலும் </w:t>
+      </w:r>
+      <w:r>
+        <w:rPr>
+          <w:highlight w:val="yellow"/>
+        </w:rPr>
+        <w:t>சிலின்டர் ஹெட்</w:t>
+      </w:r>
+      <w:r>
+        <w:rPr/>
+        <w:t xml:space="preserve"> இல் சுயாதீனமாக துளைக்கப்பட்ட பாதைகளாக பிரிக்கப்படுகிறது.</w:t>
       </w:r>
     </w:p>
     <w:p>
-      <w:r>
-        <w:rPr>
-          <w:spacing w:val="-2"/>
+      <w:pPr>
+        <w:pStyle w:val="ListParagraph"/>
+        <w:numPr>
+          <w:ilvl w:val="1"/>
+          <w:numId w:val="14"/>
+        </w:numPr>
+        <w:tabs>
+          <w:tab w:val="left" w:pos="468"/>
+        </w:tabs>
+        <w:spacing w:before="59"/>
+        <w:ind w:left="468" w:hanging="225"/>
+        <w:rPr>
           <w:sz w:val="20"/>
         </w:rPr>
-        <w:t>actuators</w:t>
-      </w:r>
+      </w:pPr>
       <w:r>
         <w:rPr>
           <w:sz w:val="20"/>
         </w:rPr>
-        <w:t>इनपुट और एक्जॉस्ट वीवीटी एक्ट्यूएटर</w:t>
+        <w:t>நுழைவு மற்றும் வெளியேற்ற VVT செயலிகள்</w:t>
       </w:r>
     </w:p>
     <w:p>
-      <w:r>
-        <w:t>camshaft front upper housing and each camshaft for the camshaft timing control.</w:t>
-      </w:r>
-      <w:r>
-        <w:rPr/>
-        <w:t>तेल को टाइमिंग चेन कवर, प्रत्येक ओसीवी, सिलेंडर हेड, कैमशाफ्ट फ्रंट निचले आवास, कैमशाफ्ट फ्रंट ऊपरी आवास और कैमशाफ्ट टाइमिंग कंट्रोल के लिए प्रत्येक कैमशाफ्ट के माध्यम से आपूर्ति की जाती है।</w:t>
+      <w:pPr>
+        <w:pStyle w:val="BodyText"/>
+        <w:spacing w:before="10" w:line="249" w:lineRule="auto"/>
+        <w:ind w:left="470" w:right="401"/>
+      </w:pPr>
+      <w:r>
+        <w:rPr>
+          <w:highlight w:val="yellow"/>
+        </w:rPr>
+        <w:t>டைமிங் செயின் கவர்</w:t>
+      </w:r>
+      <w:r>
+        <w:rPr/>
+        <w:t xml:space="preserve"> வழியாக எண்ணெய் வழங்கப்படுகிறது, ஒவ்வொரு OCV, </w:t>
+      </w:r>
+      <w:r>
+        <w:rPr>
+          <w:highlight w:val="yellow"/>
+        </w:rPr>
+        <w:t>சிலின்டர் ஹெட்</w:t>
+      </w:r>
+      <w:r>
+        <w:rPr/>
+        <w:t xml:space="preserve"> , </w:t>
+      </w:r>
+      <w:r>
+        <w:rPr>
+          <w:highlight w:val="yellow"/>
+        </w:rPr>
+        <w:t>கேம்ஷாப்ட்</w:t>
+      </w:r>
+      <w:r>
+        <w:rPr/>
+        <w:t xml:space="preserve"> முன் கீழ் அறை, </w:t>
+      </w:r>
+      <w:r>
+        <w:rPr>
+          <w:highlight w:val="yellow"/>
+        </w:rPr>
+        <w:t>கேம்ஷாப்ட்</w:t>
+      </w:r>
+      <w:r>
+        <w:rPr/>
+        <w:t xml:space="preserve"> முன் மேல் அறை மற்றும் ஒவ்வொரு </w:t>
+      </w:r>
+      <w:r>
+        <w:rPr>
+          <w:highlight w:val="yellow"/>
+        </w:rPr>
+        <w:t>கேம்ஷாப்ட்</w:t>
+      </w:r>
+      <w:r>
+        <w:rPr/>
+        <w:t xml:space="preserve"> _ ம் </w:t>
+      </w:r>
+      <w:r>
+        <w:rPr>
+          <w:highlight w:val="yellow"/>
+        </w:rPr>
+        <w:t>கேம்ஷாப்ட்</w:t>
+      </w:r>
+      <w:r>
+        <w:rPr/>
+        <w:t xml:space="preserve"> நேரக் கட்டுப்பாட்டிற்காக.</w:t>
       </w:r>
     </w:p>
     <w:p>
-      <w:r>
-        <w:rPr>
-          <w:spacing w:val="-2"/>
+      <w:pPr>
+        <w:pStyle w:val="ListParagraph"/>
+        <w:numPr>
+          <w:ilvl w:val="1"/>
+          <w:numId w:val="14"/>
+        </w:numPr>
+        <w:tabs>
+          <w:tab w:val="left" w:pos="468"/>
+        </w:tabs>
+        <w:spacing w:before="59"/>
+        <w:ind w:left="468" w:hanging="225"/>
+        <w:rPr>
           <w:sz w:val="20"/>
         </w:rPr>
-        <w:t>journal</w:t>
-      </w:r>
+      </w:pPr>
       <w:r>
         <w:rPr>
           <w:sz w:val="20"/>
-        </w:rPr>
-        <w:t>कैमशाफ्ट जर्नल</w:t>
+          <w:highlight w:val="yellow"/>
+        </w:rPr>
+        <w:t>கேம்ஷாப்ட்</w:t>
+      </w:r>
+      <w:r>
+        <w:rPr>
+          <w:sz w:val="20"/>
+        </w:rPr>
+        <w:t xml:space="preserve"> journal</w:t>
       </w:r>
     </w:p>
     <w:p>
-      <w:r>
-        <w:t>camshaft front upper housing.</w:t>
-      </w:r>
-      <w:r>
-        <w:rPr/>
-        <w:t>No.1 पत्रिकाओं को प्रत्येक ओसीवी से तेल से चिकनाई की जाती है, कैमशाफ्ट फ्रंट निचले आवास और कैमशाफ्ट फ्रंट ऊपरी आवास के मार्गों के माध्यम से।</w:t>
+      <w:pPr>
+        <w:pStyle w:val="BodyText"/>
+        <w:spacing w:before="10" w:line="249" w:lineRule="auto"/>
+        <w:ind w:left="470" w:right="401"/>
+      </w:pPr>
+      <w:r>
+        <w:rPr/>
+        <w:t xml:space="preserve">No.1. No.1 </w:t>
+      </w:r>
+      <w:r>
+        <w:rPr>
+          <w:highlight w:val="yellow"/>
+        </w:rPr>
+        <w:t>ஜெர்னல்ஸ்</w:t>
+      </w:r>
+      <w:r>
+        <w:rPr/>
+        <w:t xml:space="preserve"> ஆகியவை ஒவ்வொரு OCV இலிருந்து எண்ணெய் மூலம் மெருகூட்டப்படுகின்றன </w:t>
+      </w:r>
+      <w:r>
+        <w:rPr>
+          <w:highlight w:val="yellow"/>
+        </w:rPr>
+        <w:t>சிலின்டர் ஹெட்</w:t>
+      </w:r>
+      <w:r>
+        <w:rPr/>
+        <w:t xml:space="preserve"> முன் கீழ் அறை மற்றும் </w:t>
+      </w:r>
+      <w:r>
+        <w:rPr>
+          <w:highlight w:val="yellow"/>
+        </w:rPr>
+        <w:t>கேம்ஷாப்ட்</w:t>
+      </w:r>
+      <w:r>
+        <w:rPr/>
+        <w:t xml:space="preserve"> முன் மேல் அறை ஆகியவற்றின் வழிகள் வழியாக.</w:t>
       </w:r>
     </w:p>
     <w:p>
-      <w:r>
-        <w:rPr>
-          <w:spacing w:val="-2"/>
+      <w:pPr>
+        <w:pStyle w:val="ListParagraph"/>
+        <w:numPr>
+          <w:ilvl w:val="1"/>
+          <w:numId w:val="14"/>
+        </w:numPr>
+        <w:tabs>
+          <w:tab w:val="left" w:pos="468"/>
+        </w:tabs>
+        <w:spacing w:before="59"/>
+        <w:ind w:left="468" w:hanging="225"/>
+        <w:rPr>
           <w:sz w:val="20"/>
         </w:rPr>
-        <w:t>adjuster</w:t>
-      </w:r>
+      </w:pPr>
       <w:r>
         <w:rPr>
           <w:sz w:val="20"/>
         </w:rPr>
-        <w:t>हाइड्रोलिक लश एडजस्टर</w:t>
+        <w:t>ஹைட்ராலிக் லேஷ் அட்ஜஸ்டர் Hydraulic lash adjuster</w:t>
       </w:r>
     </w:p>
     <w:p>
-      <w:r>
-        <w:t>valve rocker arm according to the stroke.</w:t>
-      </w:r>
-      <w:r>
-        <w:rPr/>
-        <w:t>कैमशाफ्ट जर्नल के लिए एक ही मार्गों के माध्यम से, तेल की आपूर्ति की जाती है। प्रत्येक हाइड्रोलिक लशी समायोजक के शीर्ष से, तेल को स्ट्रोक के अनुसार वाल्व रॉकर आर्म में इंजेक्ट किया जाता है।</w:t>
+      <w:pPr>
+        <w:pStyle w:val="BodyText"/>
+        <w:spacing w:before="10" w:line="249" w:lineRule="auto"/>
+        <w:ind w:left="470" w:right="401"/>
+      </w:pPr>
+      <w:r>
+        <w:rPr>
+          <w:highlight w:val="yellow"/>
+        </w:rPr>
+        <w:t>கேம்ஷாப்ட்</w:t>
+      </w:r>
+      <w:r>
+        <w:rPr/>
+        <w:t xml:space="preserve"> </w:t>
+      </w:r>
+      <w:r>
+        <w:rPr>
+          <w:highlight w:val="yellow"/>
+        </w:rPr>
+        <w:t>ஜெர்னல்ஸ்</w:t>
+      </w:r>
+      <w:r>
+        <w:rPr/>
+        <w:t xml:space="preserve"> க்கான அதே பாதைகள் வழியாக, எண்ணெய் வழங்கப்படுகிறது. ஒவ்வொரு ஹைட்ராலிக் மார்பளவு சரிசெய்தியின் மேலே இருந்து, மோதிரத்தின் படி </w:t>
+      </w:r>
+      <w:r>
+        <w:rPr>
+          <w:highlight w:val="yellow"/>
+        </w:rPr>
+        <w:t>வால்வ்</w:t>
+      </w:r>
+      <w:r>
+        <w:rPr/>
+        <w:t xml:space="preserve"> ராக்கர் கைக்கு எண்ணெய்யை ஊசி போடப்படுகிறது.</w:t>
       </w:r>
     </w:p>
     <w:p>
-      <w:r>
-        <w:rPr>
-          <w:spacing w:val="-2"/>
+      <w:pPr>
+        <w:pStyle w:val="ListParagraph"/>
+        <w:numPr>
+          <w:ilvl w:val="1"/>
+          <w:numId w:val="14"/>
+        </w:numPr>
+        <w:tabs>
+          <w:tab w:val="left" w:pos="468"/>
+        </w:tabs>
+        <w:spacing w:before="58"/>
+        <w:ind w:left="468" w:hanging="225"/>
+        <w:rPr>
           <w:sz w:val="20"/>
         </w:rPr>
-        <w:t>surface</w:t>
-      </w:r>
+      </w:pPr>
       <w:r>
         <w:rPr>
           <w:sz w:val="20"/>
-        </w:rPr>
-        <w:t>वाल्व रॉकर आर्म और कैम सतह</w:t>
+          <w:highlight w:val="yellow"/>
+        </w:rPr>
+        <w:t>வால்வ்</w:t>
+      </w:r>
+      <w:r>
+        <w:rPr>
+          <w:sz w:val="20"/>
+        </w:rPr>
+        <w:t xml:space="preserve"> ராக்கர் கை மற்றும் கேம் மேற்பரப்பு</w:t>
       </w:r>
     </w:p>
     <w:p>
-      <w:r>
-        <w:t>arm including its roller bearing and corresponding cam surface.</w:t>
-      </w:r>
-      <w:r>
-        <w:rPr/>
-        <w:t>वाल्व रॉकर आर्म के माध्यम से हाइड्रोलिक लश एडजस्टर के शीर्ष से छिड़का हुआ तेल वाल्व रॉकर आर्म को उसके रोलर बीयरिंग और संबंधित कैम सतह सहित चिकनाई करता है।</w:t>
+      <w:pPr>
+        <w:pStyle w:val="BodyText"/>
+        <w:spacing w:before="10" w:line="249" w:lineRule="auto"/>
+        <w:ind w:left="470" w:hanging="1"/>
+      </w:pPr>
+      <w:r>
+        <w:rPr>
+          <w:highlight w:val="yellow"/>
+        </w:rPr>
+        <w:t>வால்வ்</w:t>
+      </w:r>
+      <w:r>
+        <w:rPr/>
+        <w:t xml:space="preserve"> ராக்கர் கரத்தின் வழியாக ஹைட்ராலிக் மார்பக சரிசெய்தியின் மேலே இருந்து எரியும் எண்ணெய் அதன் ரோலர் தாங்கு உருளை மற்றும் அதனுடன் தொடர்புடைய கேம் மேற்பரப்பை உள்ளடக்கியது.</w:t>
       </w:r>
     </w:p>
     <w:p>
-      <w:r>
-        <w:t>exceeds specified value.</w:t>
-      </w:r>
-      <w:r>
-        <w:rPr/>
-        <w:t>तेल पंप एक तेल रिलीफ वाल्व से लैस है जो जब दबाव निर्दिष्ट मूल्य से अधिक होता है तो तेल के दबाव को कम करता है।</w:t>
+      <w:pPr>
+        <w:pStyle w:val="BodyText"/>
+        <w:spacing w:before="2" w:line="249" w:lineRule="auto"/>
+        <w:ind w:left="470" w:right="401"/>
+      </w:pPr>
+      <w:r>
+        <w:rPr>
+          <w:highlight w:val="yellow"/>
+        </w:rPr>
+        <w:t>ஆயில் பம்ப்</w:t>
+      </w:r>
+      <w:r>
+        <w:rPr/>
+        <w:t xml:space="preserve"> ஒரு எண்ணெய் நிவாரணத்துடன் பொருத்தப்பட்டுள்ளது </w:t>
+      </w:r>
+      <w:r>
+        <w:rPr>
+          <w:highlight w:val="yellow"/>
+        </w:rPr>
+        <w:t>வால்வ்</w:t>
+      </w:r>
+      <w:r>
+        <w:rPr/>
+        <w:t xml:space="preserve"> .. இந்த </w:t>
+      </w:r>
+      <w:r>
+        <w:rPr>
+          <w:highlight w:val="yellow"/>
+        </w:rPr>
+        <w:t>வால்வ்</w:t>
+      </w:r>
+      <w:r>
+        <w:rPr/>
+        <w:t xml:space="preserve"> அழுத்தம் குறிப்பிடப்பட்ட மதிப்பை தாண்டியபோது எண்ணெய்யின் அழுத்தத்தை நிவர்த்தி செய்கிறது.</w:t>
       </w:r>
     </w:p>
     <w:p>
-      <w:r>
-        <w:t>situation, dusty oil will circulate in the engine without filtration and causes the engine damage.</w:t>
-      </w:r>
-      <w:r>
-        <w:rPr/>
-        <w:t>तेल फ़िल्टर तेल को बायपास करने के लिए एक राहत वाल्व प्रदान करता है जब तेल का दबाव फ़िल्टर के विनिर्देशों से अधिक होता है, जो खराब रखरखाव के कारण फ़िल्टर तत्व के अवरुद्ध होने के कारण होता है (फ़िल्टर को नियोजित रूप से बदलने के बिना) । इस स्थिति में, धूलदार तेल बिना फ़िल्टरेशन के इंजन में घूमता है और इंजन को नुकसान पहुंचाता है।</w:t>
+      <w:pPr>
+        <w:pStyle w:val="BodyText"/>
+        <w:spacing w:before="1" w:line="249" w:lineRule="auto"/>
+        <w:ind w:left="470" w:right="401" w:hanging="1"/>
+      </w:pPr>
+      <w:r>
+        <w:rPr>
+          <w:highlight w:val="yellow"/>
+        </w:rPr>
+        <w:t>ஆயில் பில்ட்டர்</w:t>
+      </w:r>
+      <w:r>
+        <w:rPr/>
+        <w:t xml:space="preserve"> என்பது தீங்கு விளைவிக்கும் பராமரிப்பு காரணமாக </w:t>
+      </w:r>
+      <w:r>
+        <w:rPr>
+          <w:highlight w:val="yellow"/>
+        </w:rPr>
+        <w:t>ஃபில்டர்</w:t>
+      </w:r>
+      <w:r>
+        <w:rPr/>
+        <w:t xml:space="preserve"> உறுப்பு முடக்கப்படுவதால் (திட்டமிடப்பட்டபடி </w:t>
+      </w:r>
+      <w:r>
+        <w:rPr>
+          <w:highlight w:val="yellow"/>
+        </w:rPr>
+        <w:t>ஃபில்டர்</w:t>
+      </w:r>
+      <w:r>
+        <w:rPr/>
+        <w:t xml:space="preserve"> _ ஐ மாற்றாமல்) ஏற்படும்... இந்த சூழ்நிலையில், தூசி எண்ணெய் வடிகட்டுதல் இல்லாமல் </w:t>
+      </w:r>
+      <w:r>
+        <w:rPr>
+          <w:highlight w:val="yellow"/>
+        </w:rPr>
+        <w:t>என்ஜின்</w:t>
+      </w:r>
+      <w:r>
+        <w:rPr/>
+        <w:t xml:space="preserve"> _ இல் சுழலும், மேலும் </w:t>
+      </w:r>
+      <w:r>
+        <w:rPr>
+          <w:highlight w:val="yellow"/>
+        </w:rPr>
+        <w:t>என்ஜின்</w:t>
+      </w:r>
+      <w:r>
+        <w:rPr/>
+        <w:t xml:space="preserve"> _ க்கு சேதத்தை ஏற்படுத்துகிறது.</w:t>
       </w:r>
     </w:p>
     <w:p>
-      <w:r>
-        <w:t>.</w:t>
-      </w:r>
-      <w:r>
-        <w:rPr/>
-        <w:t>सिलेंडर ब्लॉक को निष्क्रिय गति नियंत्रण के लिए एक तेल तापमान सेंसर प्रदान किया गया है। निष्क्रिय गति नियंत्रण और सेंसर निरीक्षण के लिए, अनुभाग 1C में ऑयल तापमान सेंसर ऑन-वेहिकल निरीक्षण या अनुभाग 1C में ऑयल तापमान सेंसर निरीक्षण देखें।</w:t>
+      <w:pPr>
+        <w:pStyle w:val="BodyText"/>
+        <w:spacing w:before="3" w:line="249" w:lineRule="auto"/>
+        <w:ind w:left="470" w:right="401"/>
+        <w:sectPr>
+          <w:type w:val="continuous"/>
+          <w:pgSz w:w="12240" w:h="15840"/>
+          <w:pgMar w:top="700" w:right="720" w:bottom="280" w:left="720" w:header="406" w:footer="0" w:gutter="0"/>
+          <w:cols w:space="720"/>
+        </w:sectPr>
+      </w:pPr>
+      <w:r>
+        <w:rPr>
+          <w:highlight w:val="yellow"/>
+        </w:rPr>
+        <w:t>சிலின்டர் பிளாக்</w:t>
+      </w:r>
+      <w:r>
+        <w:rPr/>
+        <w:t xml:space="preserve"> என்பது </w:t>
+      </w:r>
+      <w:r>
+        <w:rPr>
+          <w:highlight w:val="yellow"/>
+        </w:rPr>
+        <w:t>சென்சார்</w:t>
+      </w:r>
+      <w:r>
+        <w:rPr/>
+        <w:t xml:space="preserve"> எண்ணெய் வெப்பநிலையைக் கட்டுப்படுத்தும் </w:t>
+      </w:r>
+      <w:r>
+        <w:rPr>
+          <w:highlight w:val="yellow"/>
+        </w:rPr>
+        <w:t>ஐடல் ஸ்பீட்</w:t>
+      </w:r>
+      <w:r>
+        <w:rPr/>
+        <w:t xml:space="preserve"> கட்டுப்பாட்டிற்காக வழங்கப்பட்டுள்ளது. </w:t>
+      </w:r>
+      <w:r>
+        <w:rPr>
+          <w:highlight w:val="yellow"/>
+        </w:rPr>
+        <w:t>ஐடல் ஸ்பீட்</w:t>
+      </w:r>
+      <w:r>
+        <w:rPr/>
+        <w:t xml:space="preserve"> _ கட்டுப்பாட்டு மற்றும் </w:t>
+      </w:r>
+      <w:r>
+        <w:rPr>
+          <w:highlight w:val="yellow"/>
+        </w:rPr>
+        <w:t>சென்சார்</w:t>
+      </w:r>
+      <w:r>
+        <w:rPr/>
+        <w:t xml:space="preserve"> _ ஆய்வுக்காக, 1C பிரிவில் உள்ள Oil </w:t>
+      </w:r>
+      <w:r>
+        <w:rPr>
+          <w:highlight w:val="yellow"/>
+        </w:rPr>
+        <w:t>சென்சார்</w:t>
+      </w:r>
+      <w:r>
+        <w:rPr/>
+        <w:t xml:space="preserve"> On-Vehicle Inspection அல்லது 1C Section இல் உள்ள _ </w:t>
+      </w:r>
+      <w:r>
+        <w:rPr>
+          <w:highlight w:val="yellow"/>
+        </w:rPr>
+        <w:t>சென்சார்</w:t>
+      </w:r>
+      <w:r>
+        <w:rPr/>
+        <w:t xml:space="preserve"> ஆய்வு ஆகியவற்றைப் பார்க்கவும்.</w:t>
       </w:r>
     </w:p>
     <w:p>

</xml_diff>